<commit_message>
docs: sync final report with charts in body text
- charts moved from appendix C into their sections (Fig1->3.2, Fig2->3.3, Fig3->3.1, Fig4->3.4)
- 6.2 heading softened ('must cache everything' -> 'optimal among tested configs')
- FIGURE-DATA.csv now notes the figure placement
</commit_message>
<xml_diff>
--- a/docs/MoE-研究报告-v1.1.docx
+++ b/docs/MoE-研究报告-v1.1.docx
@@ -1174,6 +1174,32 @@
       <w:r>
         <w:rPr/>
         <w:t xml:space="preserve">四档在四位小数精度下显示相同。这不等同于 bit-identical：更细的数值差异无法从当前输出排除，且该结论仅覆盖 20 chunks 与大批次路径，不代表 decode 路径。</w:t>
+      </w:r>
+    </w:p>
+    <w:p>
+      <w:r>
+        <w:drawing>
+          <wp:inline distT="0" distB="0" distL="0" distR="0">
+            <wp:extent cx="5400000" cy="2520000"/>
+            <wp:effectExtent l="0" t="0" r="0" b="0"/>
+            <wp:docPr id="3" name="图 3  困惑度：四档 cache 在四位小数内无差异"/>
+            <wp:cNvGraphicFramePr/>
+            <a:graphic>
+              <a:graphicData uri="http://schemas.openxmlformats.org/drawingml/2006/chart">
+                <c:chart r:id="R89a4cf996a334ebe"/>
+              </a:graphicData>
+            </a:graphic>
+          </wp:inline>
+        </w:drawing>
+      </w:r>
+    </w:p>
+    <w:p>
+      <w:pPr>
+        <w:pStyle w:val="Normal"/>
+      </w:pPr>
+      <w:r>
+        <w:rPr/>
+        <w:t xml:space="preserve"/>
       </w:r>
     </w:p>
     <w:p>
@@ -1962,6 +1988,32 @@
       </w:r>
     </w:p>
     <w:p>
+      <w:r>
+        <w:drawing>
+          <wp:inline distT="0" distB="0" distL="0" distR="0">
+            <wp:extent cx="4680000" cy="2520000"/>
+            <wp:effectExtent l="0" t="0" r="0" b="0"/>
+            <wp:docPr id="8" name="图 4  真实文本与随机 token 的 decode 速度对比（50 对样本）"/>
+            <wp:cNvGraphicFramePr/>
+            <a:graphic>
+              <a:graphicData uri="http://schemas.openxmlformats.org/drawingml/2006/chart">
+                <c:chart r:id="R5c76f32bb6764e6f"/>
+              </a:graphicData>
+            </a:graphic>
+          </wp:inline>
+        </w:drawing>
+      </w:r>
+    </w:p>
+    <w:p>
+      <w:pPr>
+        <w:pStyle w:val="Normal"/>
+      </w:pPr>
+      <w:r>
+        <w:rPr/>
+        <w:t xml:space="preserve"/>
+      </w:r>
+    </w:p>
+    <w:p>
       <w:pPr>
         <w:pStyle w:val="Heading2"/>
       </w:pPr>
@@ -1992,20 +2044,23 @@
           <w:insideH w:val="single" w:sz="4"/>
           <w:insideV w:val="single" w:sz="4"/>
         </w:tblBorders>
+        <w:tblLayout w:type="fixed"/>
         <w:tblLook w:val="04A0"/>
       </w:tblPr>
       <w:tblGrid>
-        <w:gridCol w:w="1038"/>
-        <w:gridCol w:w="1038"/>
-        <w:gridCol w:w="1038"/>
-        <w:gridCol w:w="1038"/>
-        <w:gridCol w:w="1038"/>
-        <w:gridCol w:w="1038"/>
-        <w:gridCol w:w="1038"/>
-        <w:gridCol w:w="1038"/>
+        <w:gridCol w:w="1700"/>
+        <w:gridCol w:w="1700"/>
+        <w:gridCol w:w="1900"/>
+        <w:gridCol w:w="2100"/>
+        <w:gridCol w:w="1500"/>
+        <w:gridCol w:w="1300"/>
+        <w:gridCol w:w="1600"/>
       </w:tblGrid>
       <w:tr>
         <w:tc>
+          <w:tcPr>
+            <w:tcW w:w="1700" w:type="dxa"/>
+          </w:tcPr>
           <w:p>
             <w:r>
               <w:t xml:space="preserve">ncmoe</w:t>
@@ -2013,13 +2068,19 @@
           </w:p>
         </w:tc>
         <w:tc>
-          <w:p>
-            <w:r>
-              <w:t xml:space="preserve">decode 中位</w:t>
-            </w:r>
-          </w:p>
-        </w:tc>
-        <w:tc>
+          <w:tcPr>
+            <w:tcW w:w="1700" w:type="dxa"/>
+          </w:tcPr>
+          <w:p>
+            <w:r>
+              <w:t xml:space="preserve">t/s</w:t>
+            </w:r>
+          </w:p>
+        </w:tc>
+        <w:tc>
+          <w:tcPr>
+            <w:tcW w:w="1900" w:type="dxa"/>
+          </w:tcPr>
           <w:p>
             <w:r>
               <w:t xml:space="preserve">范围</w:t>
@@ -2027,20 +2088,19 @@
           </w:p>
         </w:tc>
         <w:tc>
-          <w:p>
-            <w:r>
-              <w:t xml:space="preserve">显存峰值</w:t>
-            </w:r>
-          </w:p>
-        </w:tc>
-        <w:tc>
-          <w:p>
-            <w:r>
-              <w:t xml:space="preserve">MiB</w:t>
-            </w:r>
-          </w:p>
-        </w:tc>
-        <w:tc>
+          <w:tcPr>
+            <w:tcW w:w="2100" w:type="dxa"/>
+          </w:tcPr>
+          <w:p>
+            <w:r>
+              <w:t xml:space="preserve">显存 MiB</w:t>
+            </w:r>
+          </w:p>
+        </w:tc>
+        <w:tc>
+          <w:tcPr>
+            <w:tcW w:w="1500" w:type="dxa"/>
+          </w:tcPr>
           <w:p>
             <w:r>
               <w:t xml:space="preserve">util</w:t>
@@ -2048,6 +2108,9 @@
           </w:p>
         </w:tc>
         <w:tc>
+          <w:tcPr>
+            <w:tcW w:w="1300" w:type="dxa"/>
+          </w:tcPr>
           <w:p>
             <w:r>
               <w:t xml:space="preserve">功耗</w:t>
@@ -2055,6 +2118,9 @@
           </w:p>
         </w:tc>
         <w:tc>
+          <w:tcPr>
+            <w:tcW w:w="1600" w:type="dxa"/>
+          </w:tcPr>
           <w:p>
             <w:r>
               <w:t xml:space="preserve">崩塌</w:t>
@@ -2064,6 +2130,9 @@
       </w:tr>
       <w:tr>
         <w:tc>
+          <w:tcPr>
+            <w:tcW w:w="1700" w:type="dxa"/>
+          </w:tcPr>
           <w:p>
             <w:r>
               <w:t xml:space="preserve">48</w:t>
@@ -2071,7 +2140,9 @@
           </w:p>
         </w:tc>
         <w:tc>
-          <w:tcPr/>
+          <w:tcPr>
+            <w:tcW w:w="1700" w:type="dxa"/>
+          </w:tcPr>
           <w:p>
             <w:r>
               <w:t xml:space="preserve">80.144</w:t>
@@ -2079,6 +2150,9 @@
           </w:p>
         </w:tc>
         <w:tc>
+          <w:tcPr>
+            <w:tcW w:w="1900" w:type="dxa"/>
+          </w:tcPr>
           <w:p>
             <w:r>
               <w:t xml:space="preserve">79.89–80.92</w:t>
@@ -2086,6 +2160,9 @@
           </w:p>
         </w:tc>
         <w:tc>
+          <w:tcPr>
+            <w:tcW w:w="2100" w:type="dxa"/>
+          </w:tcPr>
           <w:p>
             <w:r>
               <w:t xml:space="preserve">14887–14912</w:t>
@@ -2093,6 +2170,9 @@
           </w:p>
         </w:tc>
         <w:tc>
+          <w:tcPr>
+            <w:tcW w:w="1500" w:type="dxa"/>
+          </w:tcPr>
           <w:p>
             <w:r>
               <w:t xml:space="preserve">85–86%</w:t>
@@ -2100,6 +2180,9 @@
           </w:p>
         </w:tc>
         <w:tc>
+          <w:tcPr>
+            <w:tcW w:w="1300" w:type="dxa"/>
+          </w:tcPr>
           <w:p>
             <w:r>
               <w:t xml:space="preserve">77–160 W</w:t>
@@ -2107,18 +2190,21 @@
           </w:p>
         </w:tc>
         <w:tc>
+          <w:tcPr>
+            <w:tcW w:w="1600" w:type="dxa"/>
+          </w:tcPr>
           <w:p>
             <w:r>
               <w:t xml:space="preserve">否</w:t>
             </w:r>
           </w:p>
         </w:tc>
-        <w:tc>
-          <w:p/>
-        </w:tc>
-      </w:tr>
-      <w:tr>
-        <w:tc>
+      </w:tr>
+      <w:tr>
+        <w:tc>
+          <w:tcPr>
+            <w:tcW w:w="1700" w:type="dxa"/>
+          </w:tcPr>
           <w:p>
             <w:r>
               <w:t xml:space="preserve">44</w:t>
@@ -2126,7 +2212,9 @@
           </w:p>
         </w:tc>
         <w:tc>
-          <w:tcPr/>
+          <w:tcPr>
+            <w:tcW w:w="1700" w:type="dxa"/>
+          </w:tcPr>
           <w:p>
             <w:r>
               <w:t xml:space="preserve">23.639</w:t>
@@ -2134,6 +2222,9 @@
           </w:p>
         </w:tc>
         <w:tc>
+          <w:tcPr>
+            <w:tcW w:w="1900" w:type="dxa"/>
+          </w:tcPr>
           <w:p>
             <w:r>
               <w:t xml:space="preserve">23.41–23.73</w:t>
@@ -2141,6 +2232,9 @@
           </w:p>
         </w:tc>
         <w:tc>
+          <w:tcPr>
+            <w:tcW w:w="2100" w:type="dxa"/>
+          </w:tcPr>
           <w:p>
             <w:r>
               <w:t xml:space="preserve">15762–15830</w:t>
@@ -2148,6 +2242,9 @@
           </w:p>
         </w:tc>
         <w:tc>
+          <w:tcPr>
+            <w:tcW w:w="1500" w:type="dxa"/>
+          </w:tcPr>
           <w:p>
             <w:r>
               <w:t xml:space="preserve">95–97%</w:t>
@@ -2155,6 +2252,9 @@
           </w:p>
         </w:tc>
         <w:tc>
+          <w:tcPr>
+            <w:tcW w:w="1300" w:type="dxa"/>
+          </w:tcPr>
           <w:p>
             <w:r>
               <w:t xml:space="preserve">63–92 W</w:t>
@@ -2162,19 +2262,21 @@
           </w:p>
         </w:tc>
         <w:tc>
-          <w:tcPr/>
-          <w:p>
-            <w:r>
-              <w:t xml:space="preserve">疑似（util 未达判据）</w:t>
-            </w:r>
-          </w:p>
-        </w:tc>
-        <w:tc>
-          <w:p/>
-        </w:tc>
-      </w:tr>
-      <w:tr>
-        <w:tc>
+          <w:tcPr>
+            <w:tcW w:w="1600" w:type="dxa"/>
+          </w:tcPr>
+          <w:p>
+            <w:r>
+              <w:t xml:space="preserve">疑似</w:t>
+            </w:r>
+          </w:p>
+        </w:tc>
+      </w:tr>
+      <w:tr>
+        <w:tc>
+          <w:tcPr>
+            <w:tcW w:w="1700" w:type="dxa"/>
+          </w:tcPr>
           <w:p>
             <w:r>
               <w:t xml:space="preserve">40</w:t>
@@ -2182,7 +2284,9 @@
           </w:p>
         </w:tc>
         <w:tc>
-          <w:tcPr/>
+          <w:tcPr>
+            <w:tcW w:w="1700" w:type="dxa"/>
+          </w:tcPr>
           <w:p>
             <w:r>
               <w:t xml:space="preserve">19.547</w:t>
@@ -2190,6 +2294,9 @@
           </w:p>
         </w:tc>
         <w:tc>
+          <w:tcPr>
+            <w:tcW w:w="1900" w:type="dxa"/>
+          </w:tcPr>
           <w:p>
             <w:r>
               <w:t xml:space="preserve">19.54–19.58</w:t>
@@ -2197,6 +2304,9 @@
           </w:p>
         </w:tc>
         <w:tc>
+          <w:tcPr>
+            <w:tcW w:w="2100" w:type="dxa"/>
+          </w:tcPr>
           <w:p>
             <w:r>
               <w:t xml:space="preserve">15801–15811</w:t>
@@ -2204,6 +2314,9 @@
           </w:p>
         </w:tc>
         <w:tc>
+          <w:tcPr>
+            <w:tcW w:w="1500" w:type="dxa"/>
+          </w:tcPr>
           <w:p>
             <w:r>
               <w:t xml:space="preserve">97–100%</w:t>
@@ -2211,6 +2324,9 @@
           </w:p>
         </w:tc>
         <w:tc>
+          <w:tcPr>
+            <w:tcW w:w="1300" w:type="dxa"/>
+          </w:tcPr>
           <w:p>
             <w:r>
               <w:t xml:space="preserve">63–90 W</w:t>
@@ -2218,18 +2334,21 @@
           </w:p>
         </w:tc>
         <w:tc>
+          <w:tcPr>
+            <w:tcW w:w="1600" w:type="dxa"/>
+          </w:tcPr>
           <w:p>
             <w:r>
               <w:t xml:space="preserve">是</w:t>
             </w:r>
           </w:p>
         </w:tc>
-        <w:tc>
-          <w:p/>
-        </w:tc>
-      </w:tr>
-      <w:tr>
-        <w:tc>
+      </w:tr>
+      <w:tr>
+        <w:tc>
+          <w:tcPr>
+            <w:tcW w:w="1700" w:type="dxa"/>
+          </w:tcPr>
           <w:p>
             <w:r>
               <w:t xml:space="preserve">36</w:t>
@@ -2237,7 +2356,9 @@
           </w:p>
         </w:tc>
         <w:tc>
-          <w:tcPr/>
+          <w:tcPr>
+            <w:tcW w:w="1700" w:type="dxa"/>
+          </w:tcPr>
           <w:p>
             <w:r>
               <w:t xml:space="preserve">17.443</w:t>
@@ -2245,6 +2366,9 @@
           </w:p>
         </w:tc>
         <w:tc>
+          <w:tcPr>
+            <w:tcW w:w="1900" w:type="dxa"/>
+          </w:tcPr>
           <w:p>
             <w:r>
               <w:t xml:space="preserve">17.44–17.45</w:t>
@@ -2252,6 +2376,9 @@
           </w:p>
         </w:tc>
         <w:tc>
+          <w:tcPr>
+            <w:tcW w:w="2100" w:type="dxa"/>
+          </w:tcPr>
           <w:p>
             <w:r>
               <w:t xml:space="preserve">15816–15831</w:t>
@@ -2259,6 +2386,9 @@
           </w:p>
         </w:tc>
         <w:tc>
+          <w:tcPr>
+            <w:tcW w:w="1500" w:type="dxa"/>
+          </w:tcPr>
           <w:p>
             <w:r>
               <w:t xml:space="preserve">100%</w:t>
@@ -2266,6 +2396,9 @@
           </w:p>
         </w:tc>
         <w:tc>
+          <w:tcPr>
+            <w:tcW w:w="1300" w:type="dxa"/>
+          </w:tcPr>
           <w:p>
             <w:r>
               <w:t xml:space="preserve">64–89 W</w:t>
@@ -2273,18 +2406,21 @@
           </w:p>
         </w:tc>
         <w:tc>
+          <w:tcPr>
+            <w:tcW w:w="1600" w:type="dxa"/>
+          </w:tcPr>
           <w:p>
             <w:r>
               <w:t xml:space="preserve">是</w:t>
             </w:r>
           </w:p>
         </w:tc>
-        <w:tc>
-          <w:p/>
-        </w:tc>
-      </w:tr>
-      <w:tr>
-        <w:tc>
+      </w:tr>
+      <w:tr>
+        <w:tc>
+          <w:tcPr>
+            <w:tcW w:w="1700" w:type="dxa"/>
+          </w:tcPr>
           <w:p>
             <w:r>
               <w:t xml:space="preserve">34</w:t>
@@ -2292,7 +2428,9 @@
           </w:p>
         </w:tc>
         <w:tc>
-          <w:tcPr/>
+          <w:tcPr>
+            <w:tcW w:w="1700" w:type="dxa"/>
+          </w:tcPr>
           <w:p>
             <w:r>
               <w:t xml:space="preserve">15.818</w:t>
@@ -2300,6 +2438,9 @@
           </w:p>
         </w:tc>
         <w:tc>
+          <w:tcPr>
+            <w:tcW w:w="1900" w:type="dxa"/>
+          </w:tcPr>
           <w:p>
             <w:r>
               <w:t xml:space="preserve">15.34–15.84</w:t>
@@ -2307,6 +2448,9 @@
           </w:p>
         </w:tc>
         <w:tc>
+          <w:tcPr>
+            <w:tcW w:w="2100" w:type="dxa"/>
+          </w:tcPr>
           <w:p>
             <w:r>
               <w:t xml:space="preserve">15929–15935</w:t>
@@ -2314,6 +2458,9 @@
           </w:p>
         </w:tc>
         <w:tc>
+          <w:tcPr>
+            <w:tcW w:w="1500" w:type="dxa"/>
+          </w:tcPr>
           <w:p>
             <w:r>
               <w:t xml:space="preserve">100%</w:t>
@@ -2321,6 +2468,9 @@
           </w:p>
         </w:tc>
         <w:tc>
+          <w:tcPr>
+            <w:tcW w:w="1300" w:type="dxa"/>
+          </w:tcPr>
           <w:p>
             <w:r>
               <w:t xml:space="preserve">65–82 W</w:t>
@@ -2328,18 +2478,21 @@
           </w:p>
         </w:tc>
         <w:tc>
+          <w:tcPr>
+            <w:tcW w:w="1600" w:type="dxa"/>
+          </w:tcPr>
           <w:p>
             <w:r>
               <w:t xml:space="preserve">是</w:t>
             </w:r>
           </w:p>
         </w:tc>
-        <w:tc>
-          <w:p/>
-        </w:tc>
-      </w:tr>
-      <w:tr>
-        <w:tc>
+      </w:tr>
+      <w:tr>
+        <w:tc>
+          <w:tcPr>
+            <w:tcW w:w="1700" w:type="dxa"/>
+          </w:tcPr>
           <w:p>
             <w:r>
               <w:t xml:space="preserve">32</w:t>
@@ -2347,7 +2500,9 @@
           </w:p>
         </w:tc>
         <w:tc>
-          <w:tcPr/>
+          <w:tcPr>
+            <w:tcW w:w="1700" w:type="dxa"/>
+          </w:tcPr>
           <w:p>
             <w:r>
               <w:t xml:space="preserve">15.108</w:t>
@@ -2355,6 +2510,9 @@
           </w:p>
         </w:tc>
         <w:tc>
+          <w:tcPr>
+            <w:tcW w:w="1900" w:type="dxa"/>
+          </w:tcPr>
           <w:p>
             <w:r>
               <w:t xml:space="preserve">15.10–15.12</w:t>
@@ -2362,6 +2520,9 @@
           </w:p>
         </w:tc>
         <w:tc>
+          <w:tcPr>
+            <w:tcW w:w="2100" w:type="dxa"/>
+          </w:tcPr>
           <w:p>
             <w:r>
               <w:t xml:space="preserve">15917–15924</w:t>
@@ -2369,6 +2530,9 @@
           </w:p>
         </w:tc>
         <w:tc>
+          <w:tcPr>
+            <w:tcW w:w="1500" w:type="dxa"/>
+          </w:tcPr>
           <w:p>
             <w:r>
               <w:t xml:space="preserve">100%</w:t>
@@ -2376,6 +2540,9 @@
           </w:p>
         </w:tc>
         <w:tc>
+          <w:tcPr>
+            <w:tcW w:w="1300" w:type="dxa"/>
+          </w:tcPr>
           <w:p>
             <w:r>
               <w:t xml:space="preserve">62–84 W</w:t>
@@ -2383,15 +2550,15 @@
           </w:p>
         </w:tc>
         <w:tc>
+          <w:tcPr>
+            <w:tcW w:w="1600" w:type="dxa"/>
+          </w:tcPr>
           <w:p>
             <w:r>
               <w:t xml:space="preserve">是</w:t>
             </w:r>
           </w:p>
         </w:tc>
-        <w:tc>
-          <w:p/>
-        </w:tc>
       </w:tr>
     </w:tbl>
     <w:p>
@@ -2421,6 +2588,32 @@
       <w:r>
         <w:rPr/>
         <w:t xml:space="preserve">这解释了为什么“降低 ncmoe 让更多层上 GPU”反而变慢：cache 已占满显存，多塞进来的层无处安放，触发页迁移，落入“GPU 100% 利用率 + 功耗 &lt;90 W + 速度骤降”的静默失效模式。</w:t>
+      </w:r>
+    </w:p>
+    <w:p>
+      <w:r>
+        <w:drawing>
+          <wp:inline distT="0" distB="0" distL="0" distR="0">
+            <wp:extent cx="5400000" cy="2700000"/>
+            <wp:effectExtent l="0" t="0" r="0" b="0"/>
+            <wp:docPr id="6" name="图 1  decode 速度随专家缓存容量的变化（ncmoe 48）"/>
+            <wp:cNvGraphicFramePr/>
+            <a:graphic>
+              <a:graphicData uri="http://schemas.openxmlformats.org/drawingml/2006/chart">
+                <c:chart r:id="R41c8d5f64e8142dc"/>
+              </a:graphicData>
+            </a:graphic>
+          </wp:inline>
+        </w:drawing>
+      </w:r>
+    </w:p>
+    <w:p>
+      <w:pPr>
+        <w:pStyle w:val="Normal"/>
+      </w:pPr>
+      <w:r>
+        <w:rPr/>
+        <w:t xml:space="preserve"/>
       </w:r>
     </w:p>
     <w:p>
@@ -2644,6 +2837,33 @@
         <w:t xml:space="preserve">随机 token 比真实文本快约 37%。两轮独立测量（间隔约 1 小时）结果高度一致（68.34 / 67.96；93.53 / 93.62），说明该差异是稳定现象，不是噪声。</w:t>
       </w:r>
     </w:p>
+    <w:p>
+      <w:r>
+        <w:drawing>
+          <wp:inline distT="0" distB="0" distL="0" distR="0">
+            <wp:extent cx="5400000" cy="2700000"/>
+            <wp:effectExtent l="0" t="0" r="0" b="0"/>
+            <wp:docPr id="9" name="图 2  ncmoe 与 decode 速度：48 之后急剧崩塌（cache 固定 10752）"/>
+            <wp:cNvGraphicFramePr/>
+            <a:graphic>
+              <a:graphicData uri="http://schemas.openxmlformats.org/drawingml/2006/chart">
+                <c:chart r:id="Ra9608821eeaf4f70"/>
+              </a:graphicData>
+            </a:graphic>
+          </wp:inline>
+        </w:drawing>
+      </w:r>
+    </w:p>
+    <w:p>
+      <w:pPr>
+        <w:pStyle w:val="Normal"/>
+      </w:pPr>
+      <w:r>
+        <w:rPr/>
+        <w:t xml:space="preserve"/>
+      </w:r>
+    </w:p>
+    <w:p/>
     <w:p>
       <w:pPr>
         <w:pStyle w:val="Heading3"/>
@@ -4079,7 +4299,7 @@
       </w:pPr>
       <w:r>
         <w:rPr/>
-        <w:t xml:space="preserve">6.2　为什么 16 GB 卡上必须“全押缓存”</w:t>
+        <w:t xml:space="preserve">6.2　为什么在已测配置下全量缓存最优</w:t>
       </w:r>
     </w:p>
     <w:p>
@@ -5155,86 +5375,21 @@
       </w:pPr>
       <w:r>
         <w:rPr/>
-        <w:t xml:space="preserve">附录 C　图表</w:t>
-      </w:r>
-    </w:p>
-    <w:p>
-      <w:pPr>
-        <w:pStyle w:val="Normal"/>
-      </w:pPr>
-      <w:r>
-        <w:rPr/>
-        <w:t xml:space="preserve">本附录集中放置四张图，依次对应正文 3.2（图1）、3.3（图2）、3.1（图3）、3.4（图4）。数据均取自 CORRECTED-SUMMARY-ALL.csv 的修正后中位数。</w:t>
-      </w:r>
-    </w:p>
-    <w:p>
-      <w:r>
-        <w:drawing>
-          <wp:inline distT="0" distB="0" distL="0" distR="0">
-            <wp:extent cx="5400000" cy="2880000"/>
-            <wp:effectExtent l="0" t="0" r="0" b="0"/>
-            <wp:docPr id="1" name="图 1  decode 速度随专家缓存容量的变化（ncmoe 48）"/>
-            <wp:cNvGraphicFramePr/>
-            <a:graphic>
-              <a:graphicData uri="http://schemas.openxmlformats.org/drawingml/2006/chart">
-                <c:chart xmlns:c="http://schemas.openxmlformats.org/drawingml/2006/chart" r:id="R9a0f2a13145a49ee"/>
-              </a:graphicData>
-            </a:graphic>
-          </wp:inline>
-        </w:drawing>
-      </w:r>
-    </w:p>
-    <w:p>
-      <w:r>
-        <w:drawing>
-          <wp:inline distT="0" distB="0" distL="0" distR="0">
-            <wp:extent cx="5400000" cy="2880000"/>
-            <wp:effectExtent l="0" t="0" r="0" b="0"/>
-            <wp:docPr id="2" name="图 2  ncmoe 与 decode 速度：48 之后急剧崩塌（cache 固定 10752）"/>
-            <wp:cNvGraphicFramePr/>
-            <a:graphic>
-              <a:graphicData uri="http://schemas.openxmlformats.org/drawingml/2006/chart">
-                <c:chart r:id="Reff1362583ad47a6"/>
-              </a:graphicData>
-            </a:graphic>
-          </wp:inline>
-        </w:drawing>
-      </w:r>
-    </w:p>
-    <w:p>
-      <w:r>
-        <w:drawing>
-          <wp:inline distT="0" distB="0" distL="0" distR="0">
-            <wp:extent cx="5400000" cy="2520000"/>
-            <wp:effectExtent l="0" t="0" r="0" b="0"/>
-            <wp:docPr id="3" name="图 3  困惑度：四档 cache 在四位小数内无差异"/>
-            <wp:cNvGraphicFramePr/>
-            <a:graphic>
-              <a:graphicData uri="http://schemas.openxmlformats.org/drawingml/2006/chart">
-                <c:chart r:id="R89a4cf996a334ebe"/>
-              </a:graphicData>
-            </a:graphic>
-          </wp:inline>
-        </w:drawing>
-      </w:r>
-    </w:p>
-    <w:p>
-      <w:r>
-        <w:drawing>
-          <wp:inline distT="0" distB="0" distL="0" distR="0">
-            <wp:extent cx="4680000" cy="2520000"/>
-            <wp:effectExtent l="0" t="0" r="0" b="0"/>
-            <wp:docPr id="4" name="图 4  真实文本与随机 token 的 decode 速度对比（50 对样本）"/>
-            <wp:cNvGraphicFramePr/>
-            <a:graphic>
-              <a:graphicData uri="http://schemas.openxmlformats.org/drawingml/2006/chart">
-                <c:chart r:id="R4211038e34a04bb2"/>
-              </a:graphicData>
-            </a:graphic>
-          </wp:inline>
-        </w:drawing>
-      </w:r>
-    </w:p>
+        <w:t xml:space="preserve">附录 C　图表索引</w:t>
+      </w:r>
+    </w:p>
+    <w:p>
+      <w:pPr>
+        <w:pStyle w:val="Normal"/>
+      </w:pPr>
+      <w:r>
+        <w:rPr/>
+        <w:t xml:space="preserve">四张图均已插入正文对应章节：图 1 在 3.2 节（cache 曲线，V 型）；图 2 在 3.3.1 节（ncmoe 断崖）；图 3 在 3.1 节（PPL 四档）；图 4 在 3.4 节（真实 vs 随机）。数据取自 CORRECTED-SUMMARY-ALL.csv 的修正后中位数，图数据另存于 data/05-environment/FIGURE-DATA.csv。</w:t>
+      </w:r>
+    </w:p>
+    <w:p/>
+    <w:p/>
+    <w:p/>
     <w:sectPr>
       <w:pgSz w:w="11906" w:h="16838"/>
       <w:pgMar w:top="1440" w:right="1800" w:bottom="1440" w:left="1800"/>
@@ -5367,7 +5522,341 @@
 </w:styles>
 </file>
 
-<file path=word/charts/chart1.xml><?xml version="1.0" encoding="utf-8"?>
+<file path=word/charts/chart3.xml><?xml version="1.0" encoding="utf-8"?>
+<c:chartSpace xmlns:c="http://schemas.openxmlformats.org/drawingml/2006/chart">
+  <c:date1904 val="0"/>
+  <c:chart>
+    <c:title>
+      <c:tx>
+        <c:rich>
+          <a:bodyPr xmlns:a="http://schemas.openxmlformats.org/drawingml/2006/main"/>
+          <a:lstStyle xmlns:a="http://schemas.openxmlformats.org/drawingml/2006/main"/>
+          <a:p xmlns:a="http://schemas.openxmlformats.org/drawingml/2006/main">
+            <a:pPr>
+              <a:defRPr sz="1400" b="1"/>
+            </a:pPr>
+            <a:r>
+              <a:rPr lang="en-US" sz="1400" b="1"/>
+              <a:t>图 3  困惑度：四档 cache 在四位小数内无差异</a:t>
+            </a:r>
+          </a:p>
+        </c:rich>
+      </c:tx>
+      <c:overlay val="0"/>
+    </c:title>
+    <c:plotArea>
+      <c:layout/>
+      <c:barChart>
+        <c:barDir val="col"/>
+        <c:grouping val="clustered"/>
+        <c:varyColors val="0"/>
+        <c:ser>
+          <c:idx val="0"/>
+          <c:order val="0"/>
+          <c:tx>
+            <c:v>PPL</c:v>
+          </c:tx>
+          <c:spPr>
+            <a:solidFill xmlns:a="http://schemas.openxmlformats.org/drawingml/2006/main">
+              <a:srgbClr val="4472C4"/>
+            </a:solidFill>
+          </c:spPr>
+          <c:invertIfNegative val="0"/>
+          <c:cat>
+            <c:strLit>
+              <c:ptCount val="4"/>
+              <c:pt idx="0">
+                <c:v>0</c:v>
+              </c:pt>
+              <c:pt idx="1">
+                <c:v>512</c:v>
+              </c:pt>
+              <c:pt idx="2">
+                <c:v>2048</c:v>
+              </c:pt>
+              <c:pt idx="3">
+                <c:v>10752</c:v>
+              </c:pt>
+            </c:strLit>
+          </c:cat>
+          <c:val>
+            <c:numLit>
+              <c:formatCode>General</c:formatCode>
+              <c:ptCount val="4"/>
+              <c:pt idx="0">
+                <c:v>4.4617</c:v>
+              </c:pt>
+              <c:pt idx="1">
+                <c:v>4.4617</c:v>
+              </c:pt>
+              <c:pt idx="2">
+                <c:v>4.4617</c:v>
+              </c:pt>
+              <c:pt idx="3">
+                <c:v>4.4617</c:v>
+              </c:pt>
+            </c:numLit>
+          </c:val>
+        </c:ser>
+        <c:dLbls>
+          <c:showLegendKey val="0"/>
+          <c:showVal val="1"/>
+          <c:showCatName val="0"/>
+          <c:showSerName val="0"/>
+          <c:showPercent val="0"/>
+        </c:dLbls>
+        <c:gapWidth val="150"/>
+        <c:axId val="1"/>
+        <c:axId val="2"/>
+      </c:barChart>
+      <c:catAx>
+        <c:axId val="1"/>
+        <c:scaling>
+          <c:orientation val="minMax"/>
+        </c:scaling>
+        <c:delete val="0"/>
+        <c:axPos val="b"/>
+        <c:title>
+          <c:tx>
+            <c:rich>
+              <a:bodyPr xmlns:a="http://schemas.openxmlformats.org/drawingml/2006/main"/>
+              <a:lstStyle xmlns:a="http://schemas.openxmlformats.org/drawingml/2006/main"/>
+              <a:p xmlns:a="http://schemas.openxmlformats.org/drawingml/2006/main">
+                <a:pPr>
+                  <a:defRPr sz="1400" b="1"/>
+                </a:pPr>
+                <a:r>
+                  <a:rPr lang="en-US" sz="1400" b="1"/>
+                  <a:t>cache (MiB)</a:t>
+                </a:r>
+              </a:p>
+            </c:rich>
+          </c:tx>
+          <c:overlay val="0"/>
+        </c:title>
+        <c:majorTickMark val="out"/>
+        <c:minorTickMark val="none"/>
+        <c:tickLblPos val="nextTo"/>
+        <c:crossAx val="2"/>
+        <c:crosses val="autoZero"/>
+        <c:auto val="1"/>
+        <c:lblAlgn val="ctr"/>
+        <c:lblOffset val="100"/>
+      </c:catAx>
+      <c:valAx>
+        <c:axId val="2"/>
+        <c:scaling>
+          <c:orientation val="minMax"/>
+          <c:max val="5"/>
+          <c:min val="4"/>
+        </c:scaling>
+        <c:delete val="0"/>
+        <c:axPos val="l"/>
+        <c:majorGridlines/>
+        <c:title>
+          <c:tx>
+            <c:rich>
+              <a:bodyPr xmlns:a="http://schemas.openxmlformats.org/drawingml/2006/main"/>
+              <a:lstStyle xmlns:a="http://schemas.openxmlformats.org/drawingml/2006/main"/>
+              <a:p xmlns:a="http://schemas.openxmlformats.org/drawingml/2006/main">
+                <a:pPr>
+                  <a:defRPr sz="1400" b="1"/>
+                </a:pPr>
+                <a:r>
+                  <a:rPr lang="en-US" sz="1400" b="1"/>
+                  <a:t>PPL</a:t>
+                </a:r>
+              </a:p>
+            </c:rich>
+          </c:tx>
+          <c:overlay val="0"/>
+        </c:title>
+        <c:numFmt formatCode="General" sourceLinked="1"/>
+        <c:majorTickMark val="out"/>
+        <c:minorTickMark val="none"/>
+        <c:tickLblPos val="nextTo"/>
+        <c:crossAx val="1"/>
+        <c:crosses val="autoZero"/>
+        <c:crossBetween val="between"/>
+      </c:valAx>
+    </c:plotArea>
+    <c:plotVisOnly val="1"/>
+    <c:dispBlanksAs val="gap"/>
+  </c:chart>
+</c:chartSpace>
+</file>
+
+<file path=word/charts/chart4.xml><?xml version="1.0" encoding="utf-8"?>
+<c:chartSpace xmlns:c="http://schemas.openxmlformats.org/drawingml/2006/chart">
+  <c:date1904 val="0"/>
+  <c:chart>
+    <c:title>
+      <c:tx>
+        <c:rich>
+          <a:bodyPr xmlns:a="http://schemas.openxmlformats.org/drawingml/2006/main"/>
+          <a:lstStyle xmlns:a="http://schemas.openxmlformats.org/drawingml/2006/main"/>
+          <a:p xmlns:a="http://schemas.openxmlformats.org/drawingml/2006/main">
+            <a:pPr>
+              <a:defRPr sz="1400" b="1"/>
+            </a:pPr>
+            <a:r>
+              <a:rPr lang="en-US" sz="1400" b="1"/>
+              <a:t>图 2  ncmoe 与 decode 速度：48 之后急剧崩塌（cache 固定 10752）</a:t>
+            </a:r>
+          </a:p>
+        </c:rich>
+      </c:tx>
+      <c:overlay val="0"/>
+    </c:title>
+    <c:plotArea>
+      <c:layout/>
+      <c:lineChart>
+        <c:grouping val="standard"/>
+        <c:varyColors val="0"/>
+        <c:ser>
+          <c:idx val="0"/>
+          <c:order val="0"/>
+          <c:tx>
+            <c:v>decode t/s</c:v>
+          </c:tx>
+          <c:spPr>
+            <a:ln xmlns:a="http://schemas.openxmlformats.org/drawingml/2006/main" w="25400">
+              <a:solidFill>
+                <a:srgbClr val="4472C4"/>
+              </a:solidFill>
+            </a:ln>
+          </c:spPr>
+          <c:marker>
+            <c:symbol val="square"/>
+            <c:size val="7"/>
+          </c:marker>
+          <c:cat>
+            <c:strLit>
+              <c:ptCount val="6"/>
+              <c:pt idx="0">
+                <c:v>48</c:v>
+              </c:pt>
+              <c:pt idx="1">
+                <c:v>44</c:v>
+              </c:pt>
+              <c:pt idx="2">
+                <c:v>40</c:v>
+              </c:pt>
+              <c:pt idx="3">
+                <c:v>36</c:v>
+              </c:pt>
+              <c:pt idx="4">
+                <c:v>34</c:v>
+              </c:pt>
+              <c:pt idx="5">
+                <c:v>32</c:v>
+              </c:pt>
+            </c:strLit>
+          </c:cat>
+          <c:val>
+            <c:numLit>
+              <c:formatCode>General</c:formatCode>
+              <c:ptCount val="6"/>
+              <c:pt idx="0">
+                <c:v>80.144</c:v>
+              </c:pt>
+              <c:pt idx="1">
+                <c:v>23.639</c:v>
+              </c:pt>
+              <c:pt idx="2">
+                <c:v>19.547</c:v>
+              </c:pt>
+              <c:pt idx="3">
+                <c:v>17.443</c:v>
+              </c:pt>
+              <c:pt idx="4">
+                <c:v>15.818</c:v>
+              </c:pt>
+              <c:pt idx="5">
+                <c:v>15.108</c:v>
+              </c:pt>
+            </c:numLit>
+          </c:val>
+        </c:ser>
+        <c:axId val="1"/>
+        <c:axId val="2"/>
+      </c:lineChart>
+      <c:catAx>
+        <c:axId val="1"/>
+        <c:scaling>
+          <c:orientation val="minMax"/>
+        </c:scaling>
+        <c:delete val="0"/>
+        <c:axPos val="b"/>
+        <c:title>
+          <c:tx>
+            <c:rich>
+              <a:bodyPr xmlns:a="http://schemas.openxmlformats.org/drawingml/2006/main"/>
+              <a:lstStyle xmlns:a="http://schemas.openxmlformats.org/drawingml/2006/main"/>
+              <a:p xmlns:a="http://schemas.openxmlformats.org/drawingml/2006/main">
+                <a:pPr>
+                  <a:defRPr sz="1400" b="1"/>
+                </a:pPr>
+                <a:r>
+                  <a:rPr lang="en-US" sz="1400" b="1"/>
+                  <a:t>ncmoe（越大表示越多专家层留在 CPU）</a:t>
+                </a:r>
+              </a:p>
+            </c:rich>
+          </c:tx>
+          <c:overlay val="0"/>
+        </c:title>
+        <c:majorTickMark val="out"/>
+        <c:minorTickMark val="none"/>
+        <c:tickLblPos val="nextTo"/>
+        <c:crossAx val="2"/>
+        <c:crosses val="autoZero"/>
+        <c:auto val="1"/>
+        <c:lblAlgn val="ctr"/>
+        <c:lblOffset val="100"/>
+      </c:catAx>
+      <c:valAx>
+        <c:axId val="2"/>
+        <c:scaling>
+          <c:orientation val="minMax"/>
+        </c:scaling>
+        <c:delete val="0"/>
+        <c:axPos val="l"/>
+        <c:majorGridlines/>
+        <c:title>
+          <c:tx>
+            <c:rich>
+              <a:bodyPr xmlns:a="http://schemas.openxmlformats.org/drawingml/2006/main"/>
+              <a:lstStyle xmlns:a="http://schemas.openxmlformats.org/drawingml/2006/main"/>
+              <a:p xmlns:a="http://schemas.openxmlformats.org/drawingml/2006/main">
+                <a:pPr>
+                  <a:defRPr sz="1400" b="1"/>
+                </a:pPr>
+                <a:r>
+                  <a:rPr lang="en-US" sz="1400" b="1"/>
+                  <a:t>decode (t/s)</a:t>
+                </a:r>
+              </a:p>
+            </c:rich>
+          </c:tx>
+          <c:overlay val="0"/>
+        </c:title>
+        <c:numFmt formatCode="General" sourceLinked="1"/>
+        <c:majorTickMark val="out"/>
+        <c:minorTickMark val="none"/>
+        <c:tickLblPos val="nextTo"/>
+        <c:crossAx val="1"/>
+        <c:crosses val="autoZero"/>
+        <c:crossBetween val="between"/>
+      </c:valAx>
+    </c:plotArea>
+    <c:plotVisOnly val="1"/>
+    <c:dispBlanksAs val="gap"/>
+  </c:chart>
+</c:chartSpace>
+</file>
+
+<file path=word/charts/chart6.xml><?xml version="1.0" encoding="utf-8"?>
 <c:chartSpace xmlns:c="http://schemas.openxmlformats.org/drawingml/2006/chart">
   <c:date1904 val="0"/>
   <c:chart>
@@ -5561,341 +6050,7 @@
 </c:chartSpace>
 </file>
 
-<file path=word/charts/chart2.xml><?xml version="1.0" encoding="utf-8"?>
-<c:chartSpace xmlns:c="http://schemas.openxmlformats.org/drawingml/2006/chart">
-  <c:date1904 val="0"/>
-  <c:chart>
-    <c:title>
-      <c:tx>
-        <c:rich>
-          <a:bodyPr xmlns:a="http://schemas.openxmlformats.org/drawingml/2006/main"/>
-          <a:lstStyle xmlns:a="http://schemas.openxmlformats.org/drawingml/2006/main"/>
-          <a:p xmlns:a="http://schemas.openxmlformats.org/drawingml/2006/main">
-            <a:pPr>
-              <a:defRPr sz="1400" b="1"/>
-            </a:pPr>
-            <a:r>
-              <a:rPr lang="en-US" sz="1400" b="1"/>
-              <a:t>图 2  ncmoe 与 decode 速度：48 之后急剧崩塌（cache 固定 10752）</a:t>
-            </a:r>
-          </a:p>
-        </c:rich>
-      </c:tx>
-      <c:overlay val="0"/>
-    </c:title>
-    <c:plotArea>
-      <c:layout/>
-      <c:lineChart>
-        <c:grouping val="standard"/>
-        <c:varyColors val="0"/>
-        <c:ser>
-          <c:idx val="0"/>
-          <c:order val="0"/>
-          <c:tx>
-            <c:v>decode t/s</c:v>
-          </c:tx>
-          <c:spPr>
-            <a:ln xmlns:a="http://schemas.openxmlformats.org/drawingml/2006/main" w="25400">
-              <a:solidFill>
-                <a:srgbClr val="4472C4"/>
-              </a:solidFill>
-            </a:ln>
-          </c:spPr>
-          <c:marker>
-            <c:symbol val="square"/>
-            <c:size val="7"/>
-          </c:marker>
-          <c:cat>
-            <c:strLit>
-              <c:ptCount val="6"/>
-              <c:pt idx="0">
-                <c:v>48</c:v>
-              </c:pt>
-              <c:pt idx="1">
-                <c:v>44</c:v>
-              </c:pt>
-              <c:pt idx="2">
-                <c:v>40</c:v>
-              </c:pt>
-              <c:pt idx="3">
-                <c:v>36</c:v>
-              </c:pt>
-              <c:pt idx="4">
-                <c:v>34</c:v>
-              </c:pt>
-              <c:pt idx="5">
-                <c:v>32</c:v>
-              </c:pt>
-            </c:strLit>
-          </c:cat>
-          <c:val>
-            <c:numLit>
-              <c:formatCode>General</c:formatCode>
-              <c:ptCount val="6"/>
-              <c:pt idx="0">
-                <c:v>80.144</c:v>
-              </c:pt>
-              <c:pt idx="1">
-                <c:v>23.639</c:v>
-              </c:pt>
-              <c:pt idx="2">
-                <c:v>19.547</c:v>
-              </c:pt>
-              <c:pt idx="3">
-                <c:v>17.443</c:v>
-              </c:pt>
-              <c:pt idx="4">
-                <c:v>15.818</c:v>
-              </c:pt>
-              <c:pt idx="5">
-                <c:v>15.108</c:v>
-              </c:pt>
-            </c:numLit>
-          </c:val>
-        </c:ser>
-        <c:axId val="1"/>
-        <c:axId val="2"/>
-      </c:lineChart>
-      <c:catAx>
-        <c:axId val="1"/>
-        <c:scaling>
-          <c:orientation val="minMax"/>
-        </c:scaling>
-        <c:delete val="0"/>
-        <c:axPos val="b"/>
-        <c:title>
-          <c:tx>
-            <c:rich>
-              <a:bodyPr xmlns:a="http://schemas.openxmlformats.org/drawingml/2006/main"/>
-              <a:lstStyle xmlns:a="http://schemas.openxmlformats.org/drawingml/2006/main"/>
-              <a:p xmlns:a="http://schemas.openxmlformats.org/drawingml/2006/main">
-                <a:pPr>
-                  <a:defRPr sz="1400" b="1"/>
-                </a:pPr>
-                <a:r>
-                  <a:rPr lang="en-US" sz="1400" b="1"/>
-                  <a:t>ncmoe（越大表示越多专家层留在 CPU）</a:t>
-                </a:r>
-              </a:p>
-            </c:rich>
-          </c:tx>
-          <c:overlay val="0"/>
-        </c:title>
-        <c:majorTickMark val="out"/>
-        <c:minorTickMark val="none"/>
-        <c:tickLblPos val="nextTo"/>
-        <c:crossAx val="2"/>
-        <c:crosses val="autoZero"/>
-        <c:auto val="1"/>
-        <c:lblAlgn val="ctr"/>
-        <c:lblOffset val="100"/>
-      </c:catAx>
-      <c:valAx>
-        <c:axId val="2"/>
-        <c:scaling>
-          <c:orientation val="minMax"/>
-        </c:scaling>
-        <c:delete val="0"/>
-        <c:axPos val="l"/>
-        <c:majorGridlines/>
-        <c:title>
-          <c:tx>
-            <c:rich>
-              <a:bodyPr xmlns:a="http://schemas.openxmlformats.org/drawingml/2006/main"/>
-              <a:lstStyle xmlns:a="http://schemas.openxmlformats.org/drawingml/2006/main"/>
-              <a:p xmlns:a="http://schemas.openxmlformats.org/drawingml/2006/main">
-                <a:pPr>
-                  <a:defRPr sz="1400" b="1"/>
-                </a:pPr>
-                <a:r>
-                  <a:rPr lang="en-US" sz="1400" b="1"/>
-                  <a:t>decode (t/s)</a:t>
-                </a:r>
-              </a:p>
-            </c:rich>
-          </c:tx>
-          <c:overlay val="0"/>
-        </c:title>
-        <c:numFmt formatCode="General" sourceLinked="1"/>
-        <c:majorTickMark val="out"/>
-        <c:minorTickMark val="none"/>
-        <c:tickLblPos val="nextTo"/>
-        <c:crossAx val="1"/>
-        <c:crosses val="autoZero"/>
-        <c:crossBetween val="between"/>
-      </c:valAx>
-    </c:plotArea>
-    <c:plotVisOnly val="1"/>
-    <c:dispBlanksAs val="gap"/>
-  </c:chart>
-</c:chartSpace>
-</file>
-
-<file path=word/charts/chart3.xml><?xml version="1.0" encoding="utf-8"?>
-<c:chartSpace xmlns:c="http://schemas.openxmlformats.org/drawingml/2006/chart">
-  <c:date1904 val="0"/>
-  <c:chart>
-    <c:title>
-      <c:tx>
-        <c:rich>
-          <a:bodyPr xmlns:a="http://schemas.openxmlformats.org/drawingml/2006/main"/>
-          <a:lstStyle xmlns:a="http://schemas.openxmlformats.org/drawingml/2006/main"/>
-          <a:p xmlns:a="http://schemas.openxmlformats.org/drawingml/2006/main">
-            <a:pPr>
-              <a:defRPr sz="1400" b="1"/>
-            </a:pPr>
-            <a:r>
-              <a:rPr lang="en-US" sz="1400" b="1"/>
-              <a:t>图 3  困惑度：四档 cache 在四位小数内无差异</a:t>
-            </a:r>
-          </a:p>
-        </c:rich>
-      </c:tx>
-      <c:overlay val="0"/>
-    </c:title>
-    <c:plotArea>
-      <c:layout/>
-      <c:barChart>
-        <c:barDir val="col"/>
-        <c:grouping val="clustered"/>
-        <c:varyColors val="0"/>
-        <c:ser>
-          <c:idx val="0"/>
-          <c:order val="0"/>
-          <c:tx>
-            <c:v>PPL</c:v>
-          </c:tx>
-          <c:spPr>
-            <a:solidFill xmlns:a="http://schemas.openxmlformats.org/drawingml/2006/main">
-              <a:srgbClr val="4472C4"/>
-            </a:solidFill>
-          </c:spPr>
-          <c:invertIfNegative val="0"/>
-          <c:cat>
-            <c:strLit>
-              <c:ptCount val="4"/>
-              <c:pt idx="0">
-                <c:v>0</c:v>
-              </c:pt>
-              <c:pt idx="1">
-                <c:v>512</c:v>
-              </c:pt>
-              <c:pt idx="2">
-                <c:v>2048</c:v>
-              </c:pt>
-              <c:pt idx="3">
-                <c:v>10752</c:v>
-              </c:pt>
-            </c:strLit>
-          </c:cat>
-          <c:val>
-            <c:numLit>
-              <c:formatCode>General</c:formatCode>
-              <c:ptCount val="4"/>
-              <c:pt idx="0">
-                <c:v>4.4617</c:v>
-              </c:pt>
-              <c:pt idx="1">
-                <c:v>4.4617</c:v>
-              </c:pt>
-              <c:pt idx="2">
-                <c:v>4.4617</c:v>
-              </c:pt>
-              <c:pt idx="3">
-                <c:v>4.4617</c:v>
-              </c:pt>
-            </c:numLit>
-          </c:val>
-        </c:ser>
-        <c:dLbls>
-          <c:showLegendKey val="0"/>
-          <c:showVal val="1"/>
-          <c:showCatName val="0"/>
-          <c:showSerName val="0"/>
-          <c:showPercent val="0"/>
-        </c:dLbls>
-        <c:gapWidth val="150"/>
-        <c:axId val="1"/>
-        <c:axId val="2"/>
-      </c:barChart>
-      <c:catAx>
-        <c:axId val="1"/>
-        <c:scaling>
-          <c:orientation val="minMax"/>
-        </c:scaling>
-        <c:delete val="0"/>
-        <c:axPos val="b"/>
-        <c:title>
-          <c:tx>
-            <c:rich>
-              <a:bodyPr xmlns:a="http://schemas.openxmlformats.org/drawingml/2006/main"/>
-              <a:lstStyle xmlns:a="http://schemas.openxmlformats.org/drawingml/2006/main"/>
-              <a:p xmlns:a="http://schemas.openxmlformats.org/drawingml/2006/main">
-                <a:pPr>
-                  <a:defRPr sz="1400" b="1"/>
-                </a:pPr>
-                <a:r>
-                  <a:rPr lang="en-US" sz="1400" b="1"/>
-                  <a:t>cache (MiB)</a:t>
-                </a:r>
-              </a:p>
-            </c:rich>
-          </c:tx>
-          <c:overlay val="0"/>
-        </c:title>
-        <c:majorTickMark val="out"/>
-        <c:minorTickMark val="none"/>
-        <c:tickLblPos val="nextTo"/>
-        <c:crossAx val="2"/>
-        <c:crosses val="autoZero"/>
-        <c:auto val="1"/>
-        <c:lblAlgn val="ctr"/>
-        <c:lblOffset val="100"/>
-      </c:catAx>
-      <c:valAx>
-        <c:axId val="2"/>
-        <c:scaling>
-          <c:orientation val="minMax"/>
-          <c:max val="5"/>
-          <c:min val="4"/>
-        </c:scaling>
-        <c:delete val="0"/>
-        <c:axPos val="l"/>
-        <c:majorGridlines/>
-        <c:title>
-          <c:tx>
-            <c:rich>
-              <a:bodyPr xmlns:a="http://schemas.openxmlformats.org/drawingml/2006/main"/>
-              <a:lstStyle xmlns:a="http://schemas.openxmlformats.org/drawingml/2006/main"/>
-              <a:p xmlns:a="http://schemas.openxmlformats.org/drawingml/2006/main">
-                <a:pPr>
-                  <a:defRPr sz="1400" b="1"/>
-                </a:pPr>
-                <a:r>
-                  <a:rPr lang="en-US" sz="1400" b="1"/>
-                  <a:t>PPL</a:t>
-                </a:r>
-              </a:p>
-            </c:rich>
-          </c:tx>
-          <c:overlay val="0"/>
-        </c:title>
-        <c:numFmt formatCode="General" sourceLinked="1"/>
-        <c:majorTickMark val="out"/>
-        <c:minorTickMark val="none"/>
-        <c:tickLblPos val="nextTo"/>
-        <c:crossAx val="1"/>
-        <c:crosses val="autoZero"/>
-        <c:crossBetween val="between"/>
-      </c:valAx>
-    </c:plotArea>
-    <c:plotVisOnly val="1"/>
-    <c:dispBlanksAs val="gap"/>
-  </c:chart>
-</c:chartSpace>
-</file>
-
-<file path=word/charts/chart4.xml><?xml version="1.0" encoding="utf-8"?>
+<file path=word/charts/chart8.xml><?xml version="1.0" encoding="utf-8"?>
 <c:chartSpace xmlns:c="http://schemas.openxmlformats.org/drawingml/2006/chart">
   <c:date1904 val="0"/>
   <c:chart>

</xml_diff>

<commit_message>
docs: fix first-line indent on 11 appendix paragraphs
</commit_message>
<xml_diff>
--- a/docs/MoE-研究报告-v1.1.docx
+++ b/docs/MoE-研究报告-v1.1.docx
@@ -4839,6 +4839,7 @@
     <w:p>
       <w:pPr>
         <w:pStyle w:val="Normal"/>
+        <w:ind w:firstLineChars="200"/>
       </w:pPr>
       <w:r>
         <w:rPr/>
@@ -4857,6 +4858,7 @@
     <w:p>
       <w:pPr>
         <w:pStyle w:val="Normal"/>
+        <w:ind w:firstLineChars="200"/>
       </w:pPr>
       <w:r>
         <w:rPr/>
@@ -4875,6 +4877,7 @@
     <w:p>
       <w:pPr>
         <w:pStyle w:val="Normal"/>
+        <w:ind w:firstLineChars="200"/>
       </w:pPr>
       <w:r>
         <w:rPr/>
@@ -5115,6 +5118,7 @@
     <w:p>
       <w:pPr>
         <w:pStyle w:val="Normal"/>
+        <w:ind w:firstLineChars="200"/>
       </w:pPr>
       <w:r>
         <w:rPr/>
@@ -5124,6 +5128,7 @@
     <w:p>
       <w:pPr>
         <w:pStyle w:val="Normal"/>
+        <w:ind w:firstLineChars="200"/>
       </w:pPr>
       <w:r>
         <w:rPr/>
@@ -5142,6 +5147,7 @@
     <w:p>
       <w:pPr>
         <w:pStyle w:val="Normal"/>
+        <w:ind w:firstLineChars="200"/>
       </w:pPr>
       <w:r>
         <w:rPr/>
@@ -5151,6 +5157,7 @@
     <w:p>
       <w:pPr>
         <w:pStyle w:val="Normal"/>
+        <w:ind w:firstLineChars="200"/>
       </w:pPr>
       <w:r>
         <w:rPr/>
@@ -5160,6 +5167,7 @@
     <w:p>
       <w:pPr>
         <w:pStyle w:val="Normal"/>
+        <w:ind w:firstLineChars="200"/>
       </w:pPr>
       <w:r>
         <w:rPr/>
@@ -5345,6 +5353,7 @@
     <w:p>
       <w:pPr>
         <w:pStyle w:val="Normal"/>
+        <w:ind w:firstLineChars="200"/>
       </w:pPr>
       <w:r>
         <w:rPr/>
@@ -5363,6 +5372,7 @@
     <w:p>
       <w:pPr>
         <w:pStyle w:val="Normal"/>
+        <w:ind w:firstLineChars="200"/>
       </w:pPr>
       <w:r>
         <w:rPr/>
@@ -5381,6 +5391,7 @@
     <w:p>
       <w:pPr>
         <w:pStyle w:val="Normal"/>
+        <w:ind w:firstLineChars="200"/>
       </w:pPr>
       <w:r>
         <w:rPr/>

</xml_diff>

<commit_message>
docs: rebuild 3.2 table (was 7-col header vs 6-col data) and add Fig 1b V-shape zoom
- 3.2 table was malformed since creation: 7 header cells (显存峰值 + MiB split) vs 6 data cells.
  Rebuilt as a clean 6-column table.
- Added Fig 1b: 0-2048 MiB zoom where the V-shape (26.806 -> 20.414 -> 35.788) is clearly visible.
  On the full-range chart the 0->512 dip occupies 1/10 of the x-axis and is not readable.
- FIGURE-DATA.csv extended with the 1b series.
</commit_message>
<xml_diff>
--- a/docs/MoE-研究报告-v1.1.docx
+++ b/docs/MoE-研究报告-v1.1.docx
@@ -1425,26 +1425,25 @@
         <w:tblLook w:val="04A0"/>
       </w:tblPr>
       <w:tblGrid>
-        <w:gridCol w:w="1186"/>
-        <w:gridCol w:w="1186"/>
-        <w:gridCol w:w="1186"/>
-        <w:gridCol w:w="1186"/>
-        <w:gridCol w:w="1186"/>
-        <w:gridCol w:w="1186"/>
-        <w:gridCol w:w="1186"/>
+        <w:gridCol w:w="1400"/>
+        <w:gridCol w:w="1200"/>
+        <w:gridCol w:w="1600"/>
+        <w:gridCol w:w="1800"/>
+        <w:gridCol w:w="1100"/>
+        <w:gridCol w:w="1300"/>
       </w:tblGrid>
       <w:tr>
         <w:tc>
           <w:p>
             <w:r>
-              <w:t xml:space="preserve">cache (MiB)</w:t>
-            </w:r>
-          </w:p>
-        </w:tc>
-        <w:tc>
-          <w:p>
-            <w:r>
-              <w:t xml:space="preserve">decode 中位</w:t>
+              <w:t xml:space="preserve">cache</w:t>
+            </w:r>
+          </w:p>
+        </w:tc>
+        <w:tc>
+          <w:p>
+            <w:r>
+              <w:t xml:space="preserve">t/s</w:t>
             </w:r>
           </w:p>
         </w:tc>
@@ -1458,21 +1457,14 @@
         <w:tc>
           <w:p>
             <w:r>
-              <w:t xml:space="preserve">显存峰值</w:t>
-            </w:r>
-          </w:p>
-        </w:tc>
-        <w:tc>
-          <w:p>
-            <w:r>
-              <w:t xml:space="preserve">MiB</w:t>
-            </w:r>
-          </w:p>
-        </w:tc>
-        <w:tc>
-          <w:p>
-            <w:r>
-              <w:t xml:space="preserve">GPU util</w:t>
+              <w:t xml:space="preserve">显存 MiB</w:t>
+            </w:r>
+          </w:p>
+        </w:tc>
+        <w:tc>
+          <w:p>
+            <w:r>
+              <w:t xml:space="preserve">util</w:t>
             </w:r>
           </w:p>
         </w:tc>
@@ -1493,7 +1485,6 @@
           </w:p>
         </w:tc>
         <w:tc>
-          <w:tcPr/>
           <w:p>
             <w:r>
               <w:t xml:space="preserve">26.806</w:t>
@@ -1503,14 +1494,14 @@
         <w:tc>
           <w:p>
             <w:r>
-              <w:t xml:space="preserve">26.79–26.84</w:t>
-            </w:r>
-          </w:p>
-        </w:tc>
-        <w:tc>
-          <w:p>
-            <w:r>
-              <w:t xml:space="preserve">3502–3503</w:t>
+              <w:t xml:space="preserve">26.79-26.84</w:t>
+            </w:r>
+          </w:p>
+        </w:tc>
+        <w:tc>
+          <w:p>
+            <w:r>
+              <w:t xml:space="preserve">3502-3503</w:t>
             </w:r>
           </w:p>
         </w:tc>
@@ -1524,12 +1515,9 @@
         <w:tc>
           <w:p>
             <w:r>
-              <w:t xml:space="preserve">39–92 W</w:t>
-            </w:r>
-          </w:p>
-        </w:tc>
-        <w:tc>
-          <w:p/>
+              <w:t xml:space="preserve">39-92 W</w:t>
+            </w:r>
+          </w:p>
         </w:tc>
       </w:tr>
       <w:tr>
@@ -1541,7 +1529,6 @@
           </w:p>
         </w:tc>
         <w:tc>
-          <w:tcPr/>
           <w:p>
             <w:r>
               <w:t xml:space="preserve">20.414</w:t>
@@ -1551,7 +1538,7 @@
         <w:tc>
           <w:p>
             <w:r>
-              <w:t xml:space="preserve">20.41–20.42</w:t>
+              <w:t xml:space="preserve">20.41-20.42</w:t>
             </w:r>
           </w:p>
         </w:tc>
@@ -1572,12 +1559,9 @@
         <w:tc>
           <w:p>
             <w:r>
-              <w:t xml:space="preserve">73–96 W</w:t>
-            </w:r>
-          </w:p>
-        </w:tc>
-        <w:tc>
-          <w:p/>
+              <w:t xml:space="preserve">73-96 W</w:t>
+            </w:r>
+          </w:p>
         </w:tc>
       </w:tr>
       <w:tr>
@@ -1589,7 +1573,6 @@
           </w:p>
         </w:tc>
         <w:tc>
-          <w:tcPr/>
           <w:p>
             <w:r>
               <w:t xml:space="preserve">30.001</w:t>
@@ -1599,14 +1582,14 @@
         <w:tc>
           <w:p>
             <w:r>
-              <w:t xml:space="preserve">30.00–30.01</w:t>
-            </w:r>
-          </w:p>
-        </w:tc>
-        <w:tc>
-          <w:p>
-            <w:r>
-              <w:t xml:space="preserve">4654–4672</w:t>
+              <w:t xml:space="preserve">30.00-30.01</w:t>
+            </w:r>
+          </w:p>
+        </w:tc>
+        <w:tc>
+          <w:p>
+            <w:r>
+              <w:t xml:space="preserve">4654-4672</w:t>
             </w:r>
           </w:p>
         </w:tc>
@@ -1620,12 +1603,9 @@
         <w:tc>
           <w:p>
             <w:r>
-              <w:t xml:space="preserve">76–101 W</w:t>
-            </w:r>
-          </w:p>
-        </w:tc>
-        <w:tc>
-          <w:p/>
+              <w:t xml:space="preserve">76-101 W</w:t>
+            </w:r>
+          </w:p>
         </w:tc>
       </w:tr>
       <w:tr>
@@ -1637,7 +1617,6 @@
           </w:p>
         </w:tc>
         <w:tc>
-          <w:tcPr/>
           <w:p>
             <w:r>
               <w:t xml:space="preserve">32.424</w:t>
@@ -1647,14 +1626,14 @@
         <w:tc>
           <w:p>
             <w:r>
-              <w:t xml:space="preserve">32.41–32.43</w:t>
-            </w:r>
-          </w:p>
-        </w:tc>
-        <w:tc>
-          <w:p>
-            <w:r>
-              <w:t xml:space="preserve">5151–5250</w:t>
+              <w:t xml:space="preserve">32.41-32.43</w:t>
+            </w:r>
+          </w:p>
+        </w:tc>
+        <w:tc>
+          <w:p>
+            <w:r>
+              <w:t xml:space="preserve">5151-5250</w:t>
             </w:r>
           </w:p>
         </w:tc>
@@ -1668,12 +1647,9 @@
         <w:tc>
           <w:p>
             <w:r>
-              <w:t xml:space="preserve">76–105 W</w:t>
-            </w:r>
-          </w:p>
-        </w:tc>
-        <w:tc>
-          <w:p/>
+              <w:t xml:space="preserve">76-105 W</w:t>
+            </w:r>
+          </w:p>
         </w:tc>
       </w:tr>
       <w:tr>
@@ -1685,7 +1661,6 @@
           </w:p>
         </w:tc>
         <w:tc>
-          <w:tcPr/>
           <w:p>
             <w:r>
               <w:t xml:space="preserve">35.788</w:t>
@@ -1695,14 +1670,14 @@
         <w:tc>
           <w:p>
             <w:r>
-              <w:t xml:space="preserve">35.76–35.81</w:t>
-            </w:r>
-          </w:p>
-        </w:tc>
-        <w:tc>
-          <w:p>
-            <w:r>
-              <w:t xml:space="preserve">5677–5687</w:t>
+              <w:t xml:space="preserve">35.76-35.81</w:t>
+            </w:r>
+          </w:p>
+        </w:tc>
+        <w:tc>
+          <w:p>
+            <w:r>
+              <w:t xml:space="preserve">5677-5687</w:t>
             </w:r>
           </w:p>
         </w:tc>
@@ -1716,12 +1691,9 @@
         <w:tc>
           <w:p>
             <w:r>
-              <w:t xml:space="preserve">78–110 W</w:t>
-            </w:r>
-          </w:p>
-        </w:tc>
-        <w:tc>
-          <w:p/>
+              <w:t xml:space="preserve">78-110 W</w:t>
+            </w:r>
+          </w:p>
         </w:tc>
       </w:tr>
       <w:tr>
@@ -1733,7 +1705,6 @@
           </w:p>
         </w:tc>
         <w:tc>
-          <w:tcPr/>
           <w:p>
             <w:r>
               <w:t xml:space="preserve">42.486</w:t>
@@ -1743,33 +1714,30 @@
         <w:tc>
           <w:p>
             <w:r>
-              <w:t xml:space="preserve">42.46–42.50</w:t>
-            </w:r>
-          </w:p>
-        </w:tc>
-        <w:tc>
-          <w:p>
-            <w:r>
-              <w:t xml:space="preserve">6681–6688</w:t>
-            </w:r>
-          </w:p>
-        </w:tc>
-        <w:tc>
-          <w:p>
-            <w:r>
-              <w:t xml:space="preserve">92–95%</w:t>
-            </w:r>
-          </w:p>
-        </w:tc>
-        <w:tc>
-          <w:p>
-            <w:r>
-              <w:t xml:space="preserve">79–115 W</w:t>
-            </w:r>
-          </w:p>
-        </w:tc>
-        <w:tc>
-          <w:p/>
+              <w:t xml:space="preserve">42.46-42.50</w:t>
+            </w:r>
+          </w:p>
+        </w:tc>
+        <w:tc>
+          <w:p>
+            <w:r>
+              <w:t xml:space="preserve">6681-6688</w:t>
+            </w:r>
+          </w:p>
+        </w:tc>
+        <w:tc>
+          <w:p>
+            <w:r>
+              <w:t xml:space="preserve">92-95%</w:t>
+            </w:r>
+          </w:p>
+        </w:tc>
+        <w:tc>
+          <w:p>
+            <w:r>
+              <w:t xml:space="preserve">79-115 W</w:t>
+            </w:r>
+          </w:p>
         </w:tc>
       </w:tr>
       <w:tr>
@@ -1781,7 +1749,6 @@
           </w:p>
         </w:tc>
         <w:tc>
-          <w:tcPr/>
           <w:p>
             <w:r>
               <w:t xml:space="preserve">49.222</w:t>
@@ -1791,33 +1758,30 @@
         <w:tc>
           <w:p>
             <w:r>
-              <w:t xml:space="preserve">49.19–49.25</w:t>
-            </w:r>
-          </w:p>
-        </w:tc>
-        <w:tc>
-          <w:p>
-            <w:r>
-              <w:t xml:space="preserve">7727–7732</w:t>
-            </w:r>
-          </w:p>
-        </w:tc>
-        <w:tc>
-          <w:p>
-            <w:r>
-              <w:t xml:space="preserve">88–92%</w:t>
-            </w:r>
-          </w:p>
-        </w:tc>
-        <w:tc>
-          <w:p>
-            <w:r>
-              <w:t xml:space="preserve">76–121 W</w:t>
-            </w:r>
-          </w:p>
-        </w:tc>
-        <w:tc>
-          <w:p/>
+              <w:t xml:space="preserve">49.19-49.25</w:t>
+            </w:r>
+          </w:p>
+        </w:tc>
+        <w:tc>
+          <w:p>
+            <w:r>
+              <w:t xml:space="preserve">7727-7732</w:t>
+            </w:r>
+          </w:p>
+        </w:tc>
+        <w:tc>
+          <w:p>
+            <w:r>
+              <w:t xml:space="preserve">88-92%</w:t>
+            </w:r>
+          </w:p>
+        </w:tc>
+        <w:tc>
+          <w:p>
+            <w:r>
+              <w:t xml:space="preserve">76-121 W</w:t>
+            </w:r>
+          </w:p>
         </w:tc>
       </w:tr>
       <w:tr>
@@ -1829,7 +1793,6 @@
           </w:p>
         </w:tc>
         <w:tc>
-          <w:tcPr/>
           <w:p>
             <w:r>
               <w:t xml:space="preserve">61.675</w:t>
@@ -1839,33 +1802,30 @@
         <w:tc>
           <w:p>
             <w:r>
-              <w:t xml:space="preserve">61.63–61.76</w:t>
-            </w:r>
-          </w:p>
-        </w:tc>
-        <w:tc>
-          <w:p>
-            <w:r>
-              <w:t xml:space="preserve">9785–9801</w:t>
-            </w:r>
-          </w:p>
-        </w:tc>
-        <w:tc>
-          <w:p>
-            <w:r>
-              <w:t xml:space="preserve">90–91%</w:t>
-            </w:r>
-          </w:p>
-        </w:tc>
-        <w:tc>
-          <w:p>
-            <w:r>
-              <w:t xml:space="preserve">76–138 W</w:t>
-            </w:r>
-          </w:p>
-        </w:tc>
-        <w:tc>
-          <w:p/>
+              <w:t xml:space="preserve">61.63-61.76</w:t>
+            </w:r>
+          </w:p>
+        </w:tc>
+        <w:tc>
+          <w:p>
+            <w:r>
+              <w:t xml:space="preserve">9785-9801</w:t>
+            </w:r>
+          </w:p>
+        </w:tc>
+        <w:tc>
+          <w:p>
+            <w:r>
+              <w:t xml:space="preserve">90-91%</w:t>
+            </w:r>
+          </w:p>
+        </w:tc>
+        <w:tc>
+          <w:p>
+            <w:r>
+              <w:t xml:space="preserve">76-138 W</w:t>
+            </w:r>
+          </w:p>
         </w:tc>
       </w:tr>
       <w:tr>
@@ -1877,7 +1837,6 @@
           </w:p>
         </w:tc>
         <w:tc>
-          <w:tcPr/>
           <w:p>
             <w:r>
               <w:t xml:space="preserve">69.718</w:t>
@@ -1887,34 +1846,30 @@
         <w:tc>
           <w:p>
             <w:r>
-              <w:t xml:space="preserve">68.08–69.84</w:t>
-            </w:r>
-          </w:p>
-        </w:tc>
-        <w:tc>
-          <w:tcPr/>
-          <w:p>
-            <w:r>
-              <w:t xml:space="preserve">12128–12485</w:t>
-            </w:r>
-          </w:p>
-        </w:tc>
-        <w:tc>
-          <w:p>
-            <w:r>
-              <w:t xml:space="preserve">—</w:t>
-            </w:r>
-          </w:p>
-        </w:tc>
-        <w:tc>
-          <w:p>
-            <w:r>
-              <w:t xml:space="preserve">—</w:t>
-            </w:r>
-          </w:p>
-        </w:tc>
-        <w:tc>
-          <w:p/>
+              <w:t xml:space="preserve">68.08-69.84</w:t>
+            </w:r>
+          </w:p>
+        </w:tc>
+        <w:tc>
+          <w:p>
+            <w:r>
+              <w:t xml:space="preserve">12128-12485</w:t>
+            </w:r>
+          </w:p>
+        </w:tc>
+        <w:tc>
+          <w:p>
+            <w:r>
+              <w:t xml:space="preserve">-</w:t>
+            </w:r>
+          </w:p>
+        </w:tc>
+        <w:tc>
+          <w:p>
+            <w:r>
+              <w:t xml:space="preserve">-</w:t>
+            </w:r>
+          </w:p>
         </w:tc>
       </w:tr>
       <w:tr>
@@ -1926,7 +1881,6 @@
           </w:p>
         </w:tc>
         <w:tc>
-          <w:tcPr/>
           <w:p>
             <w:r>
               <w:t xml:space="preserve">80.673</w:t>
@@ -1936,34 +1890,30 @@
         <w:tc>
           <w:p>
             <w:r>
-              <w:t xml:space="preserve">79.47–80.81</w:t>
-            </w:r>
-          </w:p>
-        </w:tc>
-        <w:tc>
-          <w:tcPr/>
-          <w:p>
-            <w:r>
-              <w:t xml:space="preserve">14749–14814</w:t>
-            </w:r>
-          </w:p>
-        </w:tc>
-        <w:tc>
-          <w:p>
-            <w:r>
-              <w:t xml:space="preserve">85–86%</w:t>
-            </w:r>
-          </w:p>
-        </w:tc>
-        <w:tc>
-          <w:p>
-            <w:r>
-              <w:t xml:space="preserve">77–160 W</w:t>
-            </w:r>
-          </w:p>
-        </w:tc>
-        <w:tc>
-          <w:p/>
+              <w:t xml:space="preserve">79.47-80.81</w:t>
+            </w:r>
+          </w:p>
+        </w:tc>
+        <w:tc>
+          <w:p>
+            <w:r>
+              <w:t xml:space="preserve">14749-14814</w:t>
+            </w:r>
+          </w:p>
+        </w:tc>
+        <w:tc>
+          <w:p>
+            <w:r>
+              <w:t xml:space="preserve">85-86%</w:t>
+            </w:r>
+          </w:p>
+        </w:tc>
+        <w:tc>
+          <w:p>
+            <w:r>
+              <w:t xml:space="preserve">77-160 W</w:t>
+            </w:r>
+          </w:p>
         </w:tc>
       </w:tr>
     </w:tbl>
@@ -1985,6 +1935,23 @@
       <w:r>
         <w:rPr/>
         <w:t xml:space="preserve">为什么 512 反而更慢：小容量缓存带来的 PCIe 搬运开销超过被命中的收益，而此时大部分专家仍需经内存带宽读取，两条路同时受压。到 cache=10752 时命中率足够高，PCIe 成为唯一约束（见第 4 章）。</w:t>
+      </w:r>
+    </w:p>
+    <w:p>
+      <w:r>
+        <w:drawing>
+          <wp:inline distT="0" distB="0" distL="0" distR="0">
+            <wp:extent cx="5040000" cy="2520000"/>
+            <wp:effectExtent l="0" t="0" r="0" b="0"/>
+            <wp:docPr id="10" name="图 1b  小 cache 段放大：V 型谷底在 512 MiB"/>
+            <wp:cNvGraphicFramePr/>
+            <a:graphic>
+              <a:graphicData uri="http://schemas.openxmlformats.org/drawingml/2006/chart">
+                <c:chart r:id="R92edd0630f574921"/>
+              </a:graphicData>
+            </a:graphic>
+          </wp:inline>
+        </w:drawing>
       </w:r>
     </w:p>
     <w:p>
@@ -5830,6 +5797,172 @@
         <c:axId val="2"/>
         <c:scaling>
           <c:orientation val="minMax"/>
+        </c:scaling>
+        <c:delete val="0"/>
+        <c:axPos val="l"/>
+        <c:majorGridlines/>
+        <c:title>
+          <c:tx>
+            <c:rich>
+              <a:bodyPr xmlns:a="http://schemas.openxmlformats.org/drawingml/2006/main"/>
+              <a:lstStyle xmlns:a="http://schemas.openxmlformats.org/drawingml/2006/main"/>
+              <a:p xmlns:a="http://schemas.openxmlformats.org/drawingml/2006/main">
+                <a:pPr>
+                  <a:defRPr sz="1400" b="1"/>
+                </a:pPr>
+                <a:r>
+                  <a:rPr lang="en-US" sz="1400" b="1"/>
+                  <a:t>decode (t/s)</a:t>
+                </a:r>
+              </a:p>
+            </c:rich>
+          </c:tx>
+          <c:overlay val="0"/>
+        </c:title>
+        <c:numFmt formatCode="General" sourceLinked="1"/>
+        <c:majorTickMark val="out"/>
+        <c:minorTickMark val="none"/>
+        <c:tickLblPos val="nextTo"/>
+        <c:crossAx val="1"/>
+        <c:crosses val="autoZero"/>
+        <c:crossBetween val="between"/>
+      </c:valAx>
+    </c:plotArea>
+    <c:plotVisOnly val="1"/>
+    <c:dispBlanksAs val="gap"/>
+  </c:chart>
+</c:chartSpace>
+</file>
+
+<file path=word/charts/chart5.xml><?xml version="1.0" encoding="utf-8"?>
+<c:chartSpace xmlns:c="http://schemas.openxmlformats.org/drawingml/2006/chart">
+  <c:date1904 val="0"/>
+  <c:chart>
+    <c:title>
+      <c:tx>
+        <c:rich>
+          <a:bodyPr xmlns:a="http://schemas.openxmlformats.org/drawingml/2006/main"/>
+          <a:lstStyle xmlns:a="http://schemas.openxmlformats.org/drawingml/2006/main"/>
+          <a:p xmlns:a="http://schemas.openxmlformats.org/drawingml/2006/main">
+            <a:pPr>
+              <a:defRPr sz="1400" b="1"/>
+            </a:pPr>
+            <a:r>
+              <a:rPr lang="en-US" sz="1400" b="1"/>
+              <a:t>图 1b  小 cache 段放大：V 型谷底在 512 MiB</a:t>
+            </a:r>
+          </a:p>
+        </c:rich>
+      </c:tx>
+      <c:overlay val="0"/>
+    </c:title>
+    <c:plotArea>
+      <c:layout/>
+      <c:lineChart>
+        <c:grouping val="standard"/>
+        <c:varyColors val="0"/>
+        <c:ser>
+          <c:idx val="0"/>
+          <c:order val="0"/>
+          <c:tx>
+            <c:v>decode t/s</c:v>
+          </c:tx>
+          <c:spPr>
+            <a:ln xmlns:a="http://schemas.openxmlformats.org/drawingml/2006/main" w="25400">
+              <a:solidFill>
+                <a:srgbClr val="4472C4"/>
+              </a:solidFill>
+            </a:ln>
+          </c:spPr>
+          <c:marker>
+            <c:symbol val="circle"/>
+            <c:size val="9"/>
+          </c:marker>
+          <c:cat>
+            <c:strLit>
+              <c:ptCount val="5"/>
+              <c:pt idx="0">
+                <c:v>0</c:v>
+              </c:pt>
+              <c:pt idx="1">
+                <c:v>512</c:v>
+              </c:pt>
+              <c:pt idx="2">
+                <c:v>1024</c:v>
+              </c:pt>
+              <c:pt idx="3">
+                <c:v>1536</c:v>
+              </c:pt>
+              <c:pt idx="4">
+                <c:v>2048</c:v>
+              </c:pt>
+            </c:strLit>
+          </c:cat>
+          <c:val>
+            <c:numLit>
+              <c:formatCode>General</c:formatCode>
+              <c:ptCount val="5"/>
+              <c:pt idx="0">
+                <c:v>26.806</c:v>
+              </c:pt>
+              <c:pt idx="1">
+                <c:v>20.414</c:v>
+              </c:pt>
+              <c:pt idx="2">
+                <c:v>30.001</c:v>
+              </c:pt>
+              <c:pt idx="3">
+                <c:v>32.424</c:v>
+              </c:pt>
+              <c:pt idx="4">
+                <c:v>35.788</c:v>
+              </c:pt>
+            </c:numLit>
+          </c:val>
+        </c:ser>
+        <c:axId val="1"/>
+        <c:axId val="2"/>
+      </c:lineChart>
+      <c:catAx>
+        <c:axId val="1"/>
+        <c:scaling>
+          <c:orientation val="minMax"/>
+        </c:scaling>
+        <c:delete val="0"/>
+        <c:axPos val="b"/>
+        <c:title>
+          <c:tx>
+            <c:rich>
+              <a:bodyPr xmlns:a="http://schemas.openxmlformats.org/drawingml/2006/main"/>
+              <a:lstStyle xmlns:a="http://schemas.openxmlformats.org/drawingml/2006/main"/>
+              <a:p xmlns:a="http://schemas.openxmlformats.org/drawingml/2006/main">
+                <a:pPr>
+                  <a:defRPr sz="1400" b="1"/>
+                </a:pPr>
+                <a:r>
+                  <a:rPr lang="en-US" sz="1400" b="1"/>
+                  <a:t>cache (MiB)</a:t>
+                </a:r>
+              </a:p>
+            </c:rich>
+          </c:tx>
+          <c:overlay val="0"/>
+        </c:title>
+        <c:majorTickMark val="out"/>
+        <c:minorTickMark val="none"/>
+        <c:tickLblPos val="nextTo"/>
+        <c:crossAx val="2"/>
+        <c:crosses val="autoZero"/>
+        <c:auto val="1"/>
+        <c:lblAlgn val="ctr"/>
+        <c:lblOffset val="100"/>
+      </c:catAx>
+      <c:valAx>
+        <c:axId val="2"/>
+        <c:scaling>
+          <c:orientation val="minMax"/>
+          <c:max val="40"/>
+          <c:min val="15"/>
         </c:scaling>
         <c:delete val="0"/>
         <c:axPos val="l"/>

</xml_diff>

<commit_message>
fix(report): chart axes start at zero; sync stale medians in section 4 table
- axes: fig1b 15-40 -> 0-40, fig3 4-5 -> 0-5, fig1/fig2 explicitly 0

- sec4.1 table: 26.84 -> 26.806, 80.81 -> 80.673; recomputed 47.0 -> 46.9 GB/s, 97.9 -> 97.7 pct, 141.4 -> 141.2 GB/s

- 'cross-validated 83.1 pct' -> 'same-source recompute 83.1 pct (not independent)'

- 3.1.3 table 0.0000 pct -> <0.0001 pct; drop absolute wording 'unchanged' in 3.1.2 heading and limits table

- 3.2 body: 'PCIe is the only constraint' -> 'may be the main constraint (unverified)'

- appendix C: four figures -> five figures, declare all axes start at zero
</commit_message>
<xml_diff>
--- a/docs/MoE-研究报告-v1.1.docx
+++ b/docs/MoE-研究报告-v1.1.docx
@@ -105,7 +105,7 @@
       </w:pPr>
       <w:r>
         <w:rPr/>
-        <w:t xml:space="preserve">4. 瓶颈归因（解释模型，非已证实机理）：cache=0 时反推需 47.0 GB/s，对照实测内存上限 48 GB/s 闭合度 97.9%，提示该路径受内存带宽压制；cache=10752 时若每 token 全量搬运需 141.4 GB/s，远超 PCIe 4.0 x16 的有效带宽，因此若假设 PCIe 跑满则命中率约 82.7%。注意：该推理由速度与带宽常数互相反推，属循环推断，并不构成对「PCIe 是唯一瓶颈」的独立证明；1.75 GB/token 亦缺张量级账本。此项列为待独立验证。</w:t>
+        <w:t xml:space="preserve">4. 瓶颈归因（解释模型，非已证实机理）：cache=0 时反推需 46.9 GB/s，对照实测内存上限 48 GB/s 闭合度 97.7%，提示该路径受内存带宽压制；cache=10752 时若每 token 全量搬运需 141.2 GB/s，远超 PCIe 4.0 x16 的有效带宽，因此若假设 PCIe 跑满则命中率约 82.7%。注意：该推理由速度与带宽常数互相反推，属循环推断，并不构成对「PCIe 是唯一瓶颈」的独立证明；1.75 GB/token 亦缺张量级账本。此项列为待独立验证。</w:t>
       </w:r>
     </w:p>
     <w:p>
@@ -1237,7 +1237,7 @@
       </w:pPr>
       <w:r>
         <w:rPr/>
-        <w:t xml:space="preserve">3.1.2　为什么 PPL 完全不变</w:t>
+        <w:t xml:space="preserve">3.1.2　为什么 PPL 看不出变化</w:t>
       </w:r>
     </w:p>
     <w:p>
@@ -1364,8 +1364,9 @@
         </w:tc>
         <w:tc>
           <w:p>
-            <w:r>
-              <w:t xml:space="preserve">0.0000%</w:t>
+            <w:pPr/>
+            <w:r>
+              <w:t xml:space="preserve">&lt;0.0001%</w:t>
             </w:r>
           </w:p>
         </w:tc>
@@ -1407,7 +1408,7 @@
       </w:pPr>
       <w:r>
         <w:rPr/>
-        <w:t xml:space="preserve">固定 ncmoe 48、掩码 0x5555。每个配置启动一次 server，在其内部连续发送 3 次请求（同一进程内重复，非跨进程）。</w:t>
+        <w:t xml:space="preserve">固定 ncmoe 48、掩码 0x5555。每个配置启动一次 server，在其内部连续发送 3 次请求（同一进程内重复，非跨进程）。全范围曲线见图 1，0–2048 MiB 段明细见图 1b。</w:t>
       </w:r>
     </w:p>
     <w:tbl>
@@ -1934,7 +1935,7 @@
       </w:pPr>
       <w:r>
         <w:rPr/>
-        <w:t xml:space="preserve">为什么 512 反而更慢：小容量缓存带来的 PCIe 搬运开销超过被命中的收益，而此时大部分专家仍需经内存带宽读取，两条路同时受压。到 cache=10752 时命中率足够高，PCIe 成为唯一约束（见第 4 章）。</w:t>
+        <w:t xml:space="preserve">为什么 512 反而更慢：小容量缓存带来的 PCIe 搬运开销超过被命中的收益，而此时大部分专家仍需经内存带宽读取，两条路同时受压。到 cache=10752 时缓存覆盖更大，搬运开销占比下降，PCIe 搬运可能是此时的主要约束（见第 4 章，该解释未经独立验证）。</w:t>
       </w:r>
     </w:p>
     <w:p>
@@ -3403,9 +3404,10 @@
           </w:p>
         </w:tc>
         <w:tc>
-          <w:p>
-            <w:r>
-              <w:t xml:space="preserve">26.84 t/s</w:t>
+          <w:tcPr/>
+          <w:p>
+            <w:r>
+              <w:t xml:space="preserve">26.806 t/s</w:t>
             </w:r>
           </w:p>
         </w:tc>
@@ -3417,9 +3419,10 @@
           </w:p>
         </w:tc>
         <w:tc>
-          <w:p>
-            <w:r>
-              <w:t xml:space="preserve">47.0 GB/s</w:t>
+          <w:tcPr/>
+          <w:p>
+            <w:r>
+              <w:t xml:space="preserve">46.9 GB/s</w:t>
             </w:r>
           </w:p>
         </w:tc>
@@ -3431,9 +3434,10 @@
           </w:p>
         </w:tc>
         <w:tc>
-          <w:p>
-            <w:r>
-              <w:t xml:space="preserve">97.9%</w:t>
+          <w:tcPr/>
+          <w:p>
+            <w:r>
+              <w:t xml:space="preserve">97.7%</w:t>
             </w:r>
           </w:p>
         </w:tc>
@@ -3447,16 +3451,18 @@
           </w:p>
         </w:tc>
         <w:tc>
-          <w:p>
-            <w:r>
-              <w:t xml:space="preserve">80.81 t/s</w:t>
-            </w:r>
-          </w:p>
-        </w:tc>
-        <w:tc>
-          <w:p>
-            <w:r>
-              <w:t xml:space="preserve">若全不命中 141.4 GB/s</w:t>
+          <w:tcPr/>
+          <w:p>
+            <w:r>
+              <w:t xml:space="preserve">80.673 t/s</w:t>
+            </w:r>
+          </w:p>
+        </w:tc>
+        <w:tc>
+          <w:tcPr/>
+          <w:p>
+            <w:r>
+              <w:t xml:space="preserve">若全不命中 141.2 GB/s</w:t>
             </w:r>
           </w:p>
         </w:tc>
@@ -3475,9 +3481,10 @@
           </w:p>
         </w:tc>
         <w:tc>
-          <w:p>
-            <w:r>
-              <w:t xml:space="preserve">交叉验证 83.1%</w:t>
+          <w:tcPr/>
+          <w:p>
+            <w:r>
+              <w:t xml:space="preserve">同源复算 83.1%（不独立）</w:t>
             </w:r>
           </w:p>
         </w:tc>
@@ -3490,17 +3497,17 @@
       </w:pPr>
       <w:r>
         <w:rPr/>
-        <w:t xml:space="preserve">路径 A（cache=0）：实测 26.806 t/s，按每 token 1.75 GB 的估算需 47.0 GB/s，对照本机内存实测上限约 48 GB/s，闭合度 97.9%。这提示该路径可能受内存带宽压制。注意：1.75 GB/token 来自总参数与激活参数的比例估算，并非逐层张量账本；内存上限 48 GB/s 也是多组反推得到的区间值（44–48），不是标准基准测试结果。</w:t>
-      </w:r>
-    </w:p>
-    <w:p>
-      <w:pPr>
-        <w:pStyle w:val="Normal"/>
-        <w:ind w:firstLineChars="200"/>
-      </w:pPr>
-      <w:r>
-        <w:rPr/>
-        <w:t xml:space="preserve">路径 B（cache=10752）：实测 80.673 t/s。若每 token 仍需全量搬运 1.75 GB，则需 141.4 GB/s，远超 PCIe 4.0 x16 的名义有效带宽。由此可推：要么命中率足够高，要么 1.75 GB 这个估算不适用于该配置。在「PCIe 已跑满」的假设下反解得命中率约 82.7%。该 82.7% 是假设的产物，不是独立测量值；命中率超过容量占比 23.3% 只能说明专家访问集中，不能反过来证明 PCIe 跑满。</w:t>
+        <w:t xml:space="preserve">路径 A（cache=0）：实测 26.806 t/s，按每 token 1.75 GB 的估算需 46.9 GB/s，对照本机内存实测上限约 48 GB/s，闭合度 97.7%。这提示该路径可能受内存带宽压制。注意：1.75 GB/token 来自总参数与激活参数的比例估算，并非逐层张量账本；内存上限 48 GB/s 也是多组反推得到的区间值（44–48），不是标准基准测试结果。</w:t>
+      </w:r>
+    </w:p>
+    <w:p>
+      <w:pPr>
+        <w:pStyle w:val="Normal"/>
+        <w:ind w:firstLineChars="200"/>
+      </w:pPr>
+      <w:r>
+        <w:rPr/>
+        <w:t xml:space="preserve">路径 B（cache=10752）：实测 80.673 t/s。若每 token 仍需全量搬运 1.75 GB，则需 141.2 GB/s，远超 PCIe 4.0 x16 的名义有效带宽。由此可推：要么命中率足够高，要么 1.75 GB 这个估算不适用于该配置。在「PCIe 已跑满」的假设下反解得命中率约 82.7%。该 82.7% 是假设的产物，不是独立测量值；命中率超过容量占比 23.3% 只能说明专家访问集中，不能反过来证明 PCIe 跑满。</w:t>
       </w:r>
     </w:p>
     <w:p>
@@ -4017,8 +4024,9 @@
         </w:tc>
         <w:tc>
           <w:p>
-            <w:r>
-              <w:t xml:space="preserve">llama.cpp 实际部署的 fetch-only：0.0000%，且跨 4 档 cache 容量</w:t>
+            <w:pPr/>
+            <w:r>
+              <w:t xml:space="preserve">llama.cpp 实际部署的 fetch-only：四位小数内未见变化，且跨 4 档 cache 容量</w:t>
             </w:r>
           </w:p>
         </w:tc>
@@ -4063,8 +4071,9 @@
         </w:tc>
         <w:tc>
           <w:p>
-            <w:r>
-              <w:t xml:space="preserve">本实现下 PPL 完全不变，该警告不适用于 fetch-only</w:t>
+            <w:pPr/>
+            <w:r>
+              <w:t xml:space="preserve">本实现下 PPL 在四位小数内未见变化，该警告不适用于 fetch-only</w:t>
             </w:r>
           </w:p>
         </w:tc>
@@ -4810,7 +4819,7 @@
       </w:pPr>
       <w:r>
         <w:rPr/>
-        <w:t xml:space="preserve">补充说明（P7 补测）：先行研究要求「每次从日志抓命中率」。本次在 llama-server 速度路径上未能取得该统计——默认 verbosity 与 -lv 4 均只输出缓存容量，改用 taskkill 温和终止后仍未出现累计统计。但这不等于该统计不可得：源码在缓存对象析构时调用 log_stats()，真正的优雅退出可能需要 Ctrl+C，本测试未实现，故结论限定为「当前终止方式下尚未取得」。改用 perplexity 路径可得到大批次下的命中数据，但其在 2048 MiB 即饱和（cache 2048/4096/8192/10752 的复制专家数同为 34668），而同一区间 server decode 仍从 35.81 升到 80.81 t/s，两条路径的命中机制不可互相外推。详见 data/08-prepost-v32/P7-hitrate/FINDINGS.md。</w:t>
+        <w:t xml:space="preserve">补充说明（P7 补测）：先行研究要求「每次从日志抓命中率」。本次在 llama-server 速度路径上未能取得该统计——默认 verbosity 与 -lv 4 均只输出缓存容量，改用 taskkill 温和终止后仍未出现累计统计。但这不等于该统计不可得：源码在缓存对象析构时调用 log_stats()，真正的优雅退出可能需要 Ctrl+C，本测试未实现，故结论限定为「当前终止方式下尚未取得」。改用 perplexity 路径可得到大批次下的命中数据，但其在 2048 MiB 即饱和（cache 2048/4096/8192/10752 的复制专家数同为 34668），而同一区间 server decode 仍从 35.788 升到 80.673 t/s，两条路径的命中机制不可互相外推。详见 data/08-prepost-v32/P7-hitrate/FINDINGS.md。</w:t>
       </w:r>
     </w:p>
     <w:p>
@@ -5362,7 +5371,7 @@
       </w:pPr>
       <w:r>
         <w:rPr/>
-        <w:t xml:space="preserve">四张图均已插入正文对应章节：图 1 在 3.2 节（cache 曲线，V 型）；图 2 在 3.3.1 节（ncmoe 断崖）；图 3 在 3.1 节（PPL 四档）；图 4 在 3.4 节（真实 vs 随机）。数据取自 CORRECTED-SUMMARY-ALL.csv 的修正后中位数，图数据另存于 data/05-environment/FIGURE-DATA.csv。</w:t>
+        <w:t xml:space="preserve">五张图均已插入正文对应章节：图 1 与图 1b 在 3.2 节（cache 全范围曲线与 0–2048 MiB 段明细）；图 2 在 3.3.1 节（ncmoe 断崖）；图 3 在 3.1 节（PPL 四档）；图 4 在 3.4 节（真实 vs 随机）。所有图的纵轴一律自 0 起，未使用截断坐标轴放大差异。数据取自 CORRECTED-SUMMARY-ALL.csv 的修正后中位数，图数据另存于 data/05-environment/FIGURE-DATA.csv。</w:t>
       </w:r>
     </w:p>
     <w:p/>
@@ -5501,7 +5510,7 @@
 </file>
 
 <file path=word/charts/chart3.xml><?xml version="1.0" encoding="utf-8"?>
-<c:chartSpace xmlns:c="http://schemas.openxmlformats.org/drawingml/2006/chart">
+<c:chartSpace xmlns:a="http://schemas.openxmlformats.org/drawingml/2006/main" xmlns:c="http://schemas.openxmlformats.org/drawingml/2006/chart">
   <c:date1904 val="0"/>
   <c:chart>
     <c:title>
@@ -5626,7 +5635,7 @@
         <c:scaling>
           <c:orientation val="minMax"/>
           <c:max val="5"/>
-          <c:min val="4"/>
+          <c:min val="0"/>
         </c:scaling>
         <c:delete val="0"/>
         <c:axPos val="l"/>
@@ -5665,7 +5674,7 @@
 </file>
 
 <file path=word/charts/chart4.xml><?xml version="1.0" encoding="utf-8"?>
-<c:chartSpace xmlns:c="http://schemas.openxmlformats.org/drawingml/2006/chart">
+<c:chartSpace xmlns:a="http://schemas.openxmlformats.org/drawingml/2006/main" xmlns:c="http://schemas.openxmlformats.org/drawingml/2006/chart">
   <c:date1904 val="0"/>
   <c:chart>
     <c:title>
@@ -5797,6 +5806,7 @@
         <c:axId val="2"/>
         <c:scaling>
           <c:orientation val="minMax"/>
+          <c:min val="0"/>
         </c:scaling>
         <c:delete val="0"/>
         <c:axPos val="l"/>
@@ -5835,21 +5845,21 @@
 </file>
 
 <file path=word/charts/chart5.xml><?xml version="1.0" encoding="utf-8"?>
-<c:chartSpace xmlns:c="http://schemas.openxmlformats.org/drawingml/2006/chart">
+<c:chartSpace xmlns:a="http://schemas.openxmlformats.org/drawingml/2006/main" xmlns:c="http://schemas.openxmlformats.org/drawingml/2006/chart">
   <c:date1904 val="0"/>
   <c:chart>
     <c:title>
       <c:tx>
         <c:rich>
-          <a:bodyPr xmlns:a="http://schemas.openxmlformats.org/drawingml/2006/main"/>
-          <a:lstStyle xmlns:a="http://schemas.openxmlformats.org/drawingml/2006/main"/>
-          <a:p xmlns:a="http://schemas.openxmlformats.org/drawingml/2006/main">
+          <a:bodyPr/>
+          <a:lstStyle/>
+          <a:p>
             <a:pPr>
               <a:defRPr sz="1400" b="1"/>
             </a:pPr>
             <a:r>
               <a:rPr lang="en-US" sz="1400" b="1"/>
-              <a:t>图 1b  小 cache 段放大：V 型谷底在 512 MiB</a:t>
+              <a:t>图 1b  小 cache 段（0–2048 MiB）明细：512 MiB 处最低</a:t>
             </a:r>
           </a:p>
         </c:rich>
@@ -5962,7 +5972,7 @@
         <c:scaling>
           <c:orientation val="minMax"/>
           <c:max val="40"/>
-          <c:min val="15"/>
+          <c:min val="0"/>
         </c:scaling>
         <c:delete val="0"/>
         <c:axPos val="l"/>
@@ -6001,7 +6011,7 @@
 </file>
 
 <file path=word/charts/chart6.xml><?xml version="1.0" encoding="utf-8"?>
-<c:chartSpace xmlns:c="http://schemas.openxmlformats.org/drawingml/2006/chart">
+<c:chartSpace xmlns:a="http://schemas.openxmlformats.org/drawingml/2006/main" xmlns:c="http://schemas.openxmlformats.org/drawingml/2006/chart">
   <c:date1904 val="0"/>
   <c:chart>
     <c:title>
@@ -6157,6 +6167,7 @@
         <c:axId val="2"/>
         <c:scaling>
           <c:orientation val="minMax"/>
+          <c:min val="0"/>
         </c:scaling>
         <c:delete val="0"/>
         <c:axPos val="l"/>

</xml_diff>